<commit_message>
test(docx): cover list after numbered heading with a real fixture
Address review feedback:

- Trim the inline comment in the Heading branch to the maintenance
  invariant.
- Reset level_at_new_list in the Title branch too: it clears the parents
  stack the same way and had the same latent issue.
- Replace the in-memory python-docx test with a scenario appended to the
  existing list_after_num_headers.docx fixture: a list open under a
  Heading 3, then a Heading 1 whose style carries w:numPr (sharing the
  list's numId, as in numbered outline templates), list items under it,
  and a closing section after them. Without the fix the two items are
  serialized after the closing section; ground truth regenerated with
  DOCLING_GEN_TEST_DATA=1 now pins them under their heading.

Co-Authored-By: Claude Opus 5 (1M context) <noreply@anthropic.com>
Signed-off-by: Mikhail Kostryukov <mike@triptrack.net>
</commit_message>
<xml_diff>
--- a/tests/data/docx/sources/list_after_num_headers.docx
+++ b/tests/data/docx/sources/list_after_num_headers.docx
@@ -693,6 +693,86 @@
           <w:sz w:val="16"/>
         </w:rPr>
       </w:pPr>
+    </w:p>
+    <w:p>
+      <w:pPr>
+        <w:pStyle w:val="Heading3"/>
+      </w:pPr>
+      <w:r>
+        <w:br w:type="page"/>
+      </w:r>
+      <w:r>
+        <w:t>Subsection with an open list</w:t>
+      </w:r>
+    </w:p>
+    <w:p>
+      <w:pPr>
+        <w:pStyle w:val="ListParagraph"/>
+        <w:numPr>
+          <w:ilvl w:val="1"/>
+          <w:numId w:val="8"/>
+        </w:numPr>
+      </w:pPr>
+      <w:r>
+        <w:t>First item of the open list</w:t>
+      </w:r>
+    </w:p>
+    <w:p>
+      <w:pPr>
+        <w:pStyle w:val="ListParagraph"/>
+        <w:numPr>
+          <w:ilvl w:val="1"/>
+          <w:numId w:val="8"/>
+        </w:numPr>
+      </w:pPr>
+      <w:r>
+        <w:t>Second item of the open list</w:t>
+      </w:r>
+    </w:p>
+    <w:p>
+      <w:pPr>
+        <w:pStyle w:val="Heading1"/>
+      </w:pPr>
+      <w:r>
+        <w:t>Numbered outline heading</w:t>
+      </w:r>
+    </w:p>
+    <w:p>
+      <w:pPr>
+        <w:pStyle w:val="ListParagraph"/>
+        <w:numPr>
+          <w:ilvl w:val="1"/>
+          <w:numId w:val="8"/>
+        </w:numPr>
+      </w:pPr>
+      <w:r>
+        <w:t>Item under the numbered heading</w:t>
+      </w:r>
+    </w:p>
+    <w:p>
+      <w:pPr>
+        <w:pStyle w:val="ListParagraph"/>
+        <w:numPr>
+          <w:ilvl w:val="1"/>
+          <w:numId w:val="8"/>
+        </w:numPr>
+      </w:pPr>
+      <w:r>
+        <w:t>Second item under the numbered heading</w:t>
+      </w:r>
+    </w:p>
+    <w:p>
+      <w:pPr>
+        <w:pStyle w:val="Heading2"/>
+      </w:pPr>
+      <w:r>
+        <w:t>Closing section</w:t>
+      </w:r>
+    </w:p>
+    <w:p>
+      <w:r>
+        <w:t>Paragraph that closes the document.</w:t>
+      </w:r>
     </w:p>
     <w:sectPr>
       <w:pgSz w:w="10318" w:h="7370" w:orient="landscape"/>
@@ -2000,6 +2080,10 @@
       <w:spacing w:before="83"/>
       <w:ind w:left="617"/>
       <w:outlineLvl w:val="0"/>
+      <w:numPr>
+        <w:ilvl w:val="0"/>
+        <w:numId w:val="8"/>
+      </w:numPr>
     </w:pPr>
     <w:rPr>
       <w:sz w:val="80"/>

</xml_diff>